<commit_message>
Fill in the position and institution on the title page
The documentation is for the Debutant Dezvoltator Software position at
Informatica Feroviara. The PDF was exported again from the updated document.

Co-Authored-By: Claude Opus 5.5 <noreply@anthropic.com>
</commit_message>
<xml_diff>
--- a/docs/HartiCFR-Documentatie.docx
+++ b/docs/HartiCFR-Documentatie.docx
@@ -181,10 +181,9 @@
         <w:rPr>
           <w:rFonts w:ascii="Trebuchet MS" w:hAnsi="Trebuchet MS" w:cs="Arial"/>
           <w:noProof/>
-          <w:highlight w:val="yellow"/>
           <w:lang w:val="ro-RO"/>
         </w:rPr>
-        <w:t>......</w:t>
+        <w:t>Debutant Dezvoltator Software</w:t>
       </w:r>
     </w:p>
     <w:p>
@@ -210,28 +209,17 @@
         <w:rPr>
           <w:rFonts w:ascii="Trebuchet MS" w:hAnsi="Trebuchet MS" w:cs="Arial"/>
           <w:noProof/>
-          <w:highlight w:val="yellow"/>
           <w:lang w:val="ro-RO"/>
         </w:rPr>
-        <w:t>l</w:t>
+        <w:t xml:space="preserve">La </w:t>
       </w:r>
       <w:r>
         <w:rPr>
           <w:rFonts w:ascii="Trebuchet MS" w:hAnsi="Trebuchet MS" w:cs="Arial"/>
           <w:noProof/>
-          <w:highlight w:val="yellow"/>
           <w:lang w:val="ro-RO"/>
         </w:rPr>
-        <w:t xml:space="preserve">a </w:t>
-      </w:r>
-      <w:r>
-        <w:rPr>
-          <w:rFonts w:ascii="Trebuchet MS" w:hAnsi="Trebuchet MS" w:cs="Arial"/>
-          <w:noProof/>
-          <w:highlight w:val="yellow"/>
-          <w:lang w:val="ro-RO"/>
-        </w:rPr>
-        <w:t>.........</w:t>
+        <w:t>Informatica Feroviara</w:t>
       </w:r>
     </w:p>
     <w:p>
@@ -566,6 +554,7 @@
               <w:szCs w:val="22"/>
             </w:rPr>
           </w:pPr>
+          <w:proofErr w:type="spellStart"/>
           <w:r>
             <w:rPr>
               <w:rFonts w:ascii="Trebuchet MS" w:hAnsi="Trebuchet MS" w:cs="Arial"/>
@@ -574,6 +563,7 @@
             </w:rPr>
             <w:t>Cuprins</w:t>
           </w:r>
+          <w:proofErr w:type="spellEnd"/>
         </w:p>
         <w:p>
           <w:pPr>
@@ -6523,16 +6513,7 @@
           <w:sz w:val="24"/>
           <w:szCs w:val="24"/>
         </w:rPr>
-        <w:t>Ș</w:t>
-      </w:r>
-      <w:r>
-        <w:rPr>
-          <w:rFonts w:ascii="Arial" w:hAnsi="Arial" w:cs="Arial"/>
-          <w:i/>
-          <w:sz w:val="24"/>
-          <w:szCs w:val="24"/>
-        </w:rPr>
-        <w:t>terge filtrele</w:t>
+        <w:t>Șterge filtrele</w:t>
       </w:r>
       <w:r>
         <w:rPr>
@@ -9577,15 +9558,7 @@
                 <w:sz w:val="19"/>
                 <w:szCs w:val="19"/>
               </w:rPr>
-              <w:t>Ș</w:t>
-            </w:r>
-            <w:r>
-              <w:rPr>
-                <w:rFonts w:ascii="Arial" w:hAnsi="Arial" w:cs="Arial"/>
-                <w:sz w:val="19"/>
-                <w:szCs w:val="19"/>
-              </w:rPr>
-              <w:t>terge cookie-ul de sesiune.</w:t>
+              <w:t>Șterge cookie-ul de sesiune.</w:t>
             </w:r>
           </w:p>
         </w:tc>
@@ -11681,16 +11654,7 @@
                 <w:sz w:val="19"/>
                 <w:szCs w:val="19"/>
               </w:rPr>
-              <w:t>Ș</w:t>
-            </w:r>
-            <w:r>
-              <w:rPr>
-                <w:rFonts w:ascii="Arial" w:hAnsi="Arial" w:cs="Arial"/>
-                <w:i/>
-                <w:sz w:val="19"/>
-                <w:szCs w:val="19"/>
-              </w:rPr>
-              <w:t>terge filtrele</w:t>
+              <w:t>Șterge filtrele</w:t>
             </w:r>
             <w:r>
               <w:rPr>
@@ -12492,6 +12456,7 @@
         <w:rPr>
           <w:rFonts w:ascii="Arial" w:hAnsi="Arial" w:cs="Arial"/>
         </w:rPr>
+        <w:lastRenderedPageBreak/>
         <w:t>Bibliografie</w:t>
       </w:r>
       <w:bookmarkEnd w:id="25"/>

</xml_diff>